<commit_message>
courts: docx re-rendered where a keyed authority crosses a page end (19 folders: its table of authorities row now prints its first word's page, as typst does; connappct opening-brief XENG-003 green) (fb-595.54.11.2)
Co-Authored-By: Claude Opus 5.5 <noreply@anthropic.com>
Gate: fb-595-54-11-2-a3 2d8b76c3cfcd308aacd63f83fdba033aa542a307
</commit_message>
<xml_diff>
--- a/courts/fifth-circuit/louisiana/state/supreme-court/answering-brief/usage/OUTPUT-answering-brief.docx
+++ b/courts/fifth-circuit/louisiana/state/supreme-court/answering-brief/usage/OUTPUT-answering-brief.docx
@@ -644,9 +644,7 @@
               <w:t xml:space="preserve"> </w:t>
             </w:r>
             <w:r>
-              <w:t xml:space="preserve">529</w:t>
-              <w:noBreakHyphen/>
-              <w:t xml:space="preserve">5955</w:t>
+              <w:t xml:space="preserve">529-⁠5955</w:t>
             </w:r>
           </w:p>
           <w:p>
@@ -2676,7 +2674,7 @@
         <w:tab/>
       </w:r>
       <w:r>
-        <w:t xml:space="preserve">15, 29, 30</w:t>
+        <w:t xml:space="preserve">15, 29</w:t>
       </w:r>
     </w:p>
     <w:p>
@@ -3821,9 +3819,7 @@
         <w:t xml:space="preserve"> </w:t>
       </w:r>
       <w:r>
-        <w:t xml:space="preserve">2020</w:t>
-        <w:noBreakHyphen/>
-        <w:t xml:space="preserve">00020</w:t>
+        <w:t xml:space="preserve">2020-⁠00020</w:t>
       </w:r>
       <w:r>
         <w:t xml:space="preserve"> </w:t>
@@ -4387,9 +4383,7 @@
         <w:t xml:space="preserve"> </w:t>
       </w:r>
       <w:r>
-        <w:t xml:space="preserve">2019</w:t>
-        <w:noBreakHyphen/>
-        <w:t xml:space="preserve">01794</w:t>
+        <w:t xml:space="preserve">2019-⁠01794</w:t>
       </w:r>
       <w:r>
         <w:t xml:space="preserve"> </w:t>
@@ -5123,9 +5117,7 @@
         <w:t xml:space="preserve"> </w:t>
       </w:r>
       <w:r>
-        <w:t xml:space="preserve">2020</w:t>
-        <w:noBreakHyphen/>
-        <w:t xml:space="preserve">00268</w:t>
+        <w:t xml:space="preserve">2020-⁠00268</w:t>
       </w:r>
       <w:r>
         <w:t xml:space="preserve"> </w:t>
@@ -5293,9 +5285,7 @@
         <w:t xml:space="preserve"> </w:t>
       </w:r>
       <w:r>
-        <w:t xml:space="preserve">2019</w:t>
-        <w:noBreakHyphen/>
-        <w:t xml:space="preserve">02034</w:t>
+        <w:t xml:space="preserve">2019-⁠02034</w:t>
       </w:r>
       <w:r>
         <w:t xml:space="preserve"> </w:t>
@@ -5753,9 +5743,7 @@
         <w:t xml:space="preserve"> </w:t>
       </w:r>
       <w:r>
-        <w:t xml:space="preserve">2019</w:t>
-        <w:noBreakHyphen/>
-        <w:t xml:space="preserve">01900</w:t>
+        <w:t xml:space="preserve">2019-⁠01900</w:t>
       </w:r>
       <w:r>
         <w:t xml:space="preserve"> </w:t>
@@ -5851,9 +5839,7 @@
         <w:t xml:space="preserve"> </w:t>
       </w:r>
       <w:r>
-        <w:t xml:space="preserve">2020</w:t>
-        <w:noBreakHyphen/>
-        <w:t xml:space="preserve">01989</w:t>
+        <w:t xml:space="preserve">2020-⁠01989</w:t>
       </w:r>
       <w:r>
         <w:t xml:space="preserve"> </w:t>
@@ -6067,9 +6053,7 @@
         <w:t xml:space="preserve"> </w:t>
       </w:r>
       <w:r>
-        <w:t xml:space="preserve">2019</w:t>
-        <w:noBreakHyphen/>
-        <w:t xml:space="preserve">02074</w:t>
+        <w:t xml:space="preserve">2019-⁠02074</w:t>
       </w:r>
       <w:r>
         <w:t xml:space="preserve"> </w:t>
@@ -6477,9 +6461,7 @@
         <w:t xml:space="preserve"> </w:t>
       </w:r>
       <w:r>
-        <w:t xml:space="preserve">10</w:t>
-        <w:noBreakHyphen/>
-        <w:t xml:space="preserve">1164</w:t>
+        <w:t xml:space="preserve">10-⁠1164</w:t>
       </w:r>
       <w:r>
         <w:t xml:space="preserve"> </w:t>
@@ -6895,9 +6877,7 @@
         <w:t xml:space="preserve"> </w:t>
       </w:r>
       <w:r>
-        <w:t xml:space="preserve">95</w:t>
-        <w:noBreakHyphen/>
-        <w:t xml:space="preserve">2621</w:t>
+        <w:t xml:space="preserve">95-⁠2621</w:t>
       </w:r>
       <w:r>
         <w:t xml:space="preserve"> </w:t>
@@ -7029,9 +7009,7 @@
         <w:t xml:space="preserve"> </w:t>
       </w:r>
       <w:r>
-        <w:t xml:space="preserve">93-C</w:t>
-        <w:noBreakHyphen/>
-        <w:t xml:space="preserve">0690</w:t>
+        <w:t xml:space="preserve">93-C-⁠0690</w:t>
       </w:r>
       <w:r>
         <w:t xml:space="preserve"> </w:t>
@@ -7889,9 +7867,7 @@
         <w:t xml:space="preserve"> </w:t>
       </w:r>
       <w:r>
-        <w:t xml:space="preserve">2021</w:t>
-        <w:noBreakHyphen/>
-        <w:t xml:space="preserve">0589</w:t>
+        <w:t xml:space="preserve">2021-⁠0589</w:t>
       </w:r>
       <w:r>
         <w:t xml:space="preserve"> </w:t>
@@ -8763,9 +8739,7 @@
         <w:t xml:space="preserve"> </w:t>
       </w:r>
       <w:r>
-        <w:t xml:space="preserve">2019</w:t>
-        <w:noBreakHyphen/>
-        <w:t xml:space="preserve">01861</w:t>
+        <w:t xml:space="preserve">2019-⁠01861</w:t>
       </w:r>
       <w:r>
         <w:t xml:space="preserve"> </w:t>
@@ -9327,9 +9301,7 @@
         <w:t xml:space="preserve"> </w:t>
       </w:r>
       <w:r>
-        <w:t xml:space="preserve">2019</w:t>
-        <w:noBreakHyphen/>
-        <w:t xml:space="preserve">01718</w:t>
+        <w:t xml:space="preserve">2019-⁠01718</w:t>
       </w:r>
       <w:r>
         <w:t xml:space="preserve"> </w:t>
@@ -9419,9 +9391,7 @@
         <w:t xml:space="preserve"> </w:t>
       </w:r>
       <w:r>
-        <w:t xml:space="preserve">94</w:t>
-        <w:noBreakHyphen/>
-        <w:t xml:space="preserve">2982</w:t>
+        <w:t xml:space="preserve">94-⁠2982</w:t>
       </w:r>
       <w:r>
         <w:t xml:space="preserve"> </w:t>
@@ -9511,9 +9481,7 @@
         <w:t xml:space="preserve"> </w:t>
       </w:r>
       <w:r>
-        <w:t xml:space="preserve">2020</w:t>
-        <w:noBreakHyphen/>
-        <w:t xml:space="preserve">00378</w:t>
+        <w:t xml:space="preserve">2020-⁠00378</w:t>
       </w:r>
       <w:r>
         <w:t xml:space="preserve"> </w:t>
@@ -9687,9 +9655,7 @@
         <w:t xml:space="preserve"> </w:t>
       </w:r>
       <w:r>
-        <w:t xml:space="preserve">2020</w:t>
-        <w:noBreakHyphen/>
-        <w:t xml:space="preserve">00276</w:t>
+        <w:t xml:space="preserve">2020-⁠00276</w:t>
       </w:r>
       <w:r>
         <w:t xml:space="preserve"> </w:t>
@@ -9779,9 +9745,7 @@
         <w:t xml:space="preserve"> </w:t>
       </w:r>
       <w:r>
-        <w:t xml:space="preserve">2019</w:t>
-        <w:noBreakHyphen/>
-        <w:t xml:space="preserve">02053</w:t>
+        <w:t xml:space="preserve">2019-⁠02053</w:t>
       </w:r>
       <w:r>
         <w:t xml:space="preserve"> </w:t>
@@ -9871,9 +9835,7 @@
         <w:t xml:space="preserve"> </w:t>
       </w:r>
       <w:r>
-        <w:t xml:space="preserve">2020</w:t>
-        <w:noBreakHyphen/>
-        <w:t xml:space="preserve">00001</w:t>
+        <w:t xml:space="preserve">2020-⁠00001</w:t>
       </w:r>
       <w:r>
         <w:t xml:space="preserve"> </w:t>
@@ -9977,9 +9939,7 @@
         <w:t xml:space="preserve"> </w:t>
       </w:r>
       <w:r>
-        <w:t xml:space="preserve">16</w:t>
-        <w:noBreakHyphen/>
-        <w:t xml:space="preserve">0998</w:t>
+        <w:t xml:space="preserve">16-⁠0998</w:t>
       </w:r>
       <w:r>
         <w:t xml:space="preserve"> </w:t>
@@ -10193,9 +10153,7 @@
         <w:t xml:space="preserve"> </w:t>
       </w:r>
       <w:r>
-        <w:t xml:space="preserve">2019</w:t>
-        <w:noBreakHyphen/>
-        <w:t xml:space="preserve">01828</w:t>
+        <w:t xml:space="preserve">2019-⁠01828</w:t>
       </w:r>
       <w:r>
         <w:t xml:space="preserve"> </w:t>
@@ -10387,9 +10345,7 @@
         <w:t xml:space="preserve"> </w:t>
       </w:r>
       <w:r>
-        <w:t xml:space="preserve">2019</w:t>
-        <w:noBreakHyphen/>
-        <w:t xml:space="preserve">01952</w:t>
+        <w:t xml:space="preserve">2019-⁠01952</w:t>
       </w:r>
       <w:r>
         <w:t xml:space="preserve"> </w:t>
@@ -10479,9 +10435,7 @@
         <w:t xml:space="preserve"> </w:t>
       </w:r>
       <w:r>
-        <w:t xml:space="preserve">19</w:t>
-        <w:noBreakHyphen/>
-        <w:t xml:space="preserve">1929</w:t>
+        <w:t xml:space="preserve">19-⁠1929</w:t>
       </w:r>
       <w:r>
         <w:t xml:space="preserve"> </w:t>
@@ -10571,9 +10525,7 @@
         <w:t xml:space="preserve"> </w:t>
       </w:r>
       <w:r>
-        <w:t xml:space="preserve">2019</w:t>
-        <w:noBreakHyphen/>
-        <w:t xml:space="preserve">01815</w:t>
+        <w:t xml:space="preserve">2019-⁠01815</w:t>
       </w:r>
       <w:r>
         <w:t xml:space="preserve"> </w:t>
@@ -10687,9 +10639,7 @@
         <w:t xml:space="preserve"> </w:t>
       </w:r>
       <w:r>
-        <w:t xml:space="preserve">2007</w:t>
-        <w:noBreakHyphen/>
-        <w:t xml:space="preserve">2285</w:t>
+        <w:t xml:space="preserve">2007-⁠2285</w:t>
       </w:r>
       <w:r>
         <w:t xml:space="preserve"> </w:t>
@@ -10779,9 +10729,7 @@
         <w:t xml:space="preserve"> </w:t>
       </w:r>
       <w:r>
-        <w:t xml:space="preserve">2020</w:t>
-        <w:noBreakHyphen/>
-        <w:t xml:space="preserve">00291</w:t>
+        <w:t xml:space="preserve">2020-⁠00291</w:t>
       </w:r>
       <w:r>
         <w:t xml:space="preserve"> </w:t>
@@ -10871,9 +10819,7 @@
         <w:t xml:space="preserve"> </w:t>
       </w:r>
       <w:r>
-        <w:t xml:space="preserve">2020</w:t>
-        <w:noBreakHyphen/>
-        <w:t xml:space="preserve">00586</w:t>
+        <w:t xml:space="preserve">2020-⁠00586</w:t>
       </w:r>
       <w:r>
         <w:t xml:space="preserve"> </w:t>
@@ -11053,9 +10999,7 @@
         <w:t xml:space="preserve"> </w:t>
       </w:r>
       <w:r>
-        <w:t xml:space="preserve">2019</w:t>
-        <w:noBreakHyphen/>
-        <w:t xml:space="preserve">02075</w:t>
+        <w:t xml:space="preserve">2019-⁠02075</w:t>
       </w:r>
       <w:r>
         <w:t xml:space="preserve"> </w:t>
@@ -11145,9 +11089,7 @@
         <w:t xml:space="preserve"> </w:t>
       </w:r>
       <w:r>
-        <w:t xml:space="preserve">2020</w:t>
-        <w:noBreakHyphen/>
-        <w:t xml:space="preserve">00052</w:t>
+        <w:t xml:space="preserve">2020-⁠00052</w:t>
       </w:r>
       <w:r>
         <w:t xml:space="preserve"> </w:t>
@@ -11237,9 +11179,7 @@
         <w:t xml:space="preserve"> </w:t>
       </w:r>
       <w:r>
-        <w:t xml:space="preserve">2020</w:t>
-        <w:noBreakHyphen/>
-        <w:t xml:space="preserve">00055</w:t>
+        <w:t xml:space="preserve">2020-⁠00055</w:t>
       </w:r>
       <w:r>
         <w:t xml:space="preserve"> </w:t>
@@ -11329,9 +11269,7 @@
         <w:t xml:space="preserve"> </w:t>
       </w:r>
       <w:r>
-        <w:t xml:space="preserve">2019</w:t>
-        <w:noBreakHyphen/>
-        <w:t xml:space="preserve">01821</w:t>
+        <w:t xml:space="preserve">2019-⁠01821</w:t>
       </w:r>
       <w:r>
         <w:t xml:space="preserve"> </w:t>
@@ -11427,9 +11365,7 @@
         <w:t xml:space="preserve"> </w:t>
       </w:r>
       <w:r>
-        <w:t xml:space="preserve">13-CR</w:t>
-        <w:noBreakHyphen/>
-        <w:t xml:space="preserve">72522</w:t>
+        <w:t xml:space="preserve">13-CR-⁠72522</w:t>
       </w:r>
       <w:r>
         <w:t xml:space="preserve"> </w:t>
@@ -11531,9 +11467,7 @@
         <w:t xml:space="preserve"> </w:t>
       </w:r>
       <w:r>
-        <w:t xml:space="preserve">2019</w:t>
-        <w:noBreakHyphen/>
-        <w:t xml:space="preserve">01632</w:t>
+        <w:t xml:space="preserve">2019-⁠01632</w:t>
       </w:r>
       <w:r>
         <w:t xml:space="preserve"> </w:t>
@@ -11623,9 +11557,7 @@
         <w:t xml:space="preserve"> </w:t>
       </w:r>
       <w:r>
-        <w:t xml:space="preserve">2020</w:t>
-        <w:noBreakHyphen/>
-        <w:t xml:space="preserve">00873</w:t>
+        <w:t xml:space="preserve">2020-⁠00873</w:t>
       </w:r>
       <w:r>
         <w:t xml:space="preserve"> </w:t>
@@ -11715,9 +11647,7 @@
         <w:t xml:space="preserve"> </w:t>
       </w:r>
       <w:r>
-        <w:t xml:space="preserve">2021</w:t>
-        <w:noBreakHyphen/>
-        <w:t xml:space="preserve">0597</w:t>
+        <w:t xml:space="preserve">2021-⁠0597</w:t>
       </w:r>
       <w:r>
         <w:t xml:space="preserve"> </w:t>
@@ -11807,9 +11737,7 @@
         <w:t xml:space="preserve"> </w:t>
       </w:r>
       <w:r>
-        <w:t xml:space="preserve">2019</w:t>
-        <w:noBreakHyphen/>
-        <w:t xml:space="preserve">2088</w:t>
+        <w:t xml:space="preserve">2019-⁠2088</w:t>
       </w:r>
       <w:r>
         <w:t xml:space="preserve"> </w:t>
@@ -11899,9 +11827,7 @@
         <w:t xml:space="preserve"> </w:t>
       </w:r>
       <w:r>
-        <w:t xml:space="preserve">2020</w:t>
-        <w:noBreakHyphen/>
-        <w:t xml:space="preserve">00072</w:t>
+        <w:t xml:space="preserve">2020-⁠00072</w:t>
       </w:r>
       <w:r>
         <w:t xml:space="preserve"> </w:t>
@@ -11991,9 +11917,7 @@
         <w:t xml:space="preserve"> </w:t>
       </w:r>
       <w:r>
-        <w:t xml:space="preserve">2019</w:t>
-        <w:noBreakHyphen/>
-        <w:t xml:space="preserve">01354</w:t>
+        <w:t xml:space="preserve">2019-⁠01354</w:t>
       </w:r>
       <w:r>
         <w:t xml:space="preserve"> </w:t>
@@ -12083,9 +12007,7 @@
         <w:t xml:space="preserve"> </w:t>
       </w:r>
       <w:r>
-        <w:t xml:space="preserve">2020</w:t>
-        <w:noBreakHyphen/>
-        <w:t xml:space="preserve">00298</w:t>
+        <w:t xml:space="preserve">2020-⁠00298</w:t>
       </w:r>
       <w:r>
         <w:t xml:space="preserve"> </w:t>
@@ -12175,9 +12097,7 @@
         <w:t xml:space="preserve"> </w:t>
       </w:r>
       <w:r>
-        <w:t xml:space="preserve">2020</w:t>
-        <w:noBreakHyphen/>
-        <w:t xml:space="preserve">00280</w:t>
+        <w:t xml:space="preserve">2020-⁠00280</w:t>
       </w:r>
       <w:r>
         <w:t xml:space="preserve"> </w:t>
@@ -12267,9 +12187,7 @@
         <w:t xml:space="preserve"> </w:t>
       </w:r>
       <w:r>
-        <w:t xml:space="preserve">2020</w:t>
-        <w:noBreakHyphen/>
-        <w:t xml:space="preserve">00621</w:t>
+        <w:t xml:space="preserve">2020-⁠00621</w:t>
       </w:r>
       <w:r>
         <w:t xml:space="preserve"> </w:t>
@@ -12359,9 +12277,7 @@
         <w:t xml:space="preserve"> </w:t>
       </w:r>
       <w:r>
-        <w:t xml:space="preserve">2019</w:t>
-        <w:noBreakHyphen/>
-        <w:t xml:space="preserve">02066</w:t>
+        <w:t xml:space="preserve">2019-⁠02066</w:t>
       </w:r>
       <w:r>
         <w:t xml:space="preserve"> </w:t>
@@ -12451,9 +12367,7 @@
         <w:t xml:space="preserve"> </w:t>
       </w:r>
       <w:r>
-        <w:t xml:space="preserve">2019</w:t>
-        <w:noBreakHyphen/>
-        <w:t xml:space="preserve">01318</w:t>
+        <w:t xml:space="preserve">2019-⁠01318</w:t>
       </w:r>
       <w:r>
         <w:t xml:space="preserve"> </w:t>
@@ -12641,9 +12555,7 @@
         <w:t xml:space="preserve"> </w:t>
       </w:r>
       <w:r>
-        <w:t xml:space="preserve">12</w:t>
-        <w:noBreakHyphen/>
-        <w:t xml:space="preserve">2763</w:t>
+        <w:t xml:space="preserve">12-⁠2763</w:t>
       </w:r>
       <w:r>
         <w:t xml:space="preserve"> </w:t>
@@ -12733,9 +12645,7 @@
         <w:t xml:space="preserve"> </w:t>
       </w:r>
       <w:r>
-        <w:t xml:space="preserve">2021</w:t>
-        <w:noBreakHyphen/>
-        <w:t xml:space="preserve">0512</w:t>
+        <w:t xml:space="preserve">2021-⁠0512</w:t>
       </w:r>
       <w:r>
         <w:t xml:space="preserve"> </w:t>
@@ -12825,9 +12735,7 @@
         <w:t xml:space="preserve"> </w:t>
       </w:r>
       <w:r>
-        <w:t xml:space="preserve">2020</w:t>
-        <w:noBreakHyphen/>
-        <w:t xml:space="preserve">00004</w:t>
+        <w:t xml:space="preserve">2020-⁠00004</w:t>
       </w:r>
       <w:r>
         <w:t xml:space="preserve"> </w:t>
@@ -13001,9 +12909,7 @@
         <w:t xml:space="preserve"> </w:t>
       </w:r>
       <w:r>
-        <w:t xml:space="preserve">2019</w:t>
-        <w:noBreakHyphen/>
-        <w:t xml:space="preserve">02010</w:t>
+        <w:t xml:space="preserve">2019-⁠02010</w:t>
       </w:r>
       <w:r>
         <w:t xml:space="preserve"> </w:t>
@@ -13093,9 +12999,7 @@
         <w:t xml:space="preserve"> </w:t>
       </w:r>
       <w:r>
-        <w:t xml:space="preserve">2020</w:t>
-        <w:noBreakHyphen/>
-        <w:t xml:space="preserve">00069</w:t>
+        <w:t xml:space="preserve">2020-⁠00069</w:t>
       </w:r>
       <w:r>
         <w:t xml:space="preserve"> </w:t>
@@ -13185,9 +13089,7 @@
         <w:t xml:space="preserve"> </w:t>
       </w:r>
       <w:r>
-        <w:t xml:space="preserve">2020</w:t>
-        <w:noBreakHyphen/>
-        <w:t xml:space="preserve">00258</w:t>
+        <w:t xml:space="preserve">2020-⁠00258</w:t>
       </w:r>
       <w:r>
         <w:t xml:space="preserve"> </w:t>
@@ -13277,9 +13179,7 @@
         <w:t xml:space="preserve"> </w:t>
       </w:r>
       <w:r>
-        <w:t xml:space="preserve">2019</w:t>
-        <w:noBreakHyphen/>
-        <w:t xml:space="preserve">01818</w:t>
+        <w:t xml:space="preserve">2019-⁠01818</w:t>
       </w:r>
       <w:r>
         <w:t xml:space="preserve"> </w:t>
@@ -13369,9 +13269,7 @@
         <w:t xml:space="preserve"> </w:t>
       </w:r>
       <w:r>
-        <w:t xml:space="preserve">95</w:t>
-        <w:noBreakHyphen/>
-        <w:t xml:space="preserve">2385</w:t>
+        <w:t xml:space="preserve">95-⁠2385</w:t>
       </w:r>
       <w:r>
         <w:t xml:space="preserve"> </w:t>
@@ -19520,13 +19418,7 @@
         <w:t xml:space="preserve"> </w:t>
       </w:r>
       <w:r>
-        <w:t xml:space="preserve">court explained that “[w]ith a careful eye on racial demographics, the [1898 Constitutional] convention delegates sculpted a ‘facially race-neutral’ rule permitting 10-to</w:t>
-      </w:r>
-      <w:r>
-        <w:noBreakHyphen/>
-      </w:r>
-      <w:r>
-        <w:t xml:space="preserve">2 verdicts in order to ensure that African-American juror service would be meaningless.”</w:t>
+        <w:t xml:space="preserve">court explained that “[w]ith a careful eye on racial demographics, the [1898 Constitutional] convention delegates sculpted a ‘facially race-neutral’ rule permitting 10-to-⁠2 verdicts in order to ensure that African-American juror service would be meaningless.”</w:t>
       </w:r>
       <w:r>
         <w:t xml:space="preserve"> </w:t>
@@ -20209,13 +20101,7 @@
         <w:t xml:space="preserve">v. Maxie</w:t>
       </w:r>
       <w:r>
-        <w:t xml:space="preserve">, No. 13-CR</w:t>
-      </w:r>
-      <w:r>
-        <w:noBreakHyphen/>
-      </w:r>
-      <w:r>
-        <w:t xml:space="preserve">72522 (La. 11th Jud. Dist., Oct. 11, 2018), the court accepted evidence presented by Professor Thomas Frampton. Reddick App. at 1, p. 63–64. Professor Frampton analyzed a dataset of 2,280 Louisianan juror votes, and from that dataset he found that Black jurors cast 31.3% of the overall votes but represented 51.2% of the silenced, or “empty,” jury votes. Reddick App. at 1, p. 64. Based on the number of White juror votes, which made up 64% of the votes cast, White jurors made up only 43% of the silenced or “empty” jury votes.</w:t>
+        <w:t xml:space="preserve">, No. 13-CR-⁠72522 (La. 11th Jud. Dist., Oct. 11, 2018), the court accepted evidence presented by Professor Thomas Frampton. Reddick App. at 1, p. 63–64. Professor Frampton analyzed a dataset of 2,280 Louisianan juror votes, and from that dataset he found that Black jurors cast 31.3% of the overall votes but represented 51.2% of the silenced, or “empty,” jury votes. Reddick App. at 1, p. 64. Based on the number of White juror votes, which made up 64% of the votes cast, White jurors made up only 43% of the silenced or “empty” jury votes.</w:t>
       </w:r>
       <w:r>
         <w:t xml:space="preserve"> </w:t>
@@ -20644,19 +20530,7 @@
         <w:t xml:space="preserve"> </w:t>
       </w:r>
       <w:r>
-        <w:t xml:space="preserve">On the convention floor, Delegate Roy argued that the non-unanimous system was discriminatory, especially against minority defendants, but that increasing the majority required from 9</w:t>
-      </w:r>
-      <w:r>
-        <w:noBreakHyphen/>
-      </w:r>
-      <w:r>
-        <w:t xml:space="preserve">3 to 10-to</w:t>
-      </w:r>
-      <w:r>
-        <w:noBreakHyphen/>
-      </w:r>
-      <w:r>
-        <w:t xml:space="preserve">2 could lessen the discrimination. Reddick App. at 1, p. 21.</w:t>
+        <w:t xml:space="preserve">On the convention floor, Delegate Roy argued that the non-unanimous system was discriminatory, especially against minority defendants, but that increasing the majority required from 9-⁠3 to 10-to-⁠2 could lessen the discrimination. Reddick App. at 1, p. 21.</w:t>
       </w:r>
     </w:p>
     <w:p>
@@ -22423,13 +22297,7 @@
         <w:t xml:space="preserve">v. State</w:t>
       </w:r>
       <w:r>
-        <w:t xml:space="preserve">, 2021</w:t>
-      </w:r>
-      <w:r>
-        <w:noBreakHyphen/>
-      </w:r>
-      <w:r>
-        <w:t xml:space="preserve">0589 (La. App. 4 Cir. 11/18/21) (denying the State’s writ);</w:t>
+        <w:t xml:space="preserve">, 2021-⁠0589 (La. App. 4 Cir. 11/18/21) (denying the State’s writ);</w:t>
       </w:r>
       <w:r>
         <w:t xml:space="preserve"> </w:t>
@@ -22442,13 +22310,7 @@
         <w:t xml:space="preserve">State v. Waldron</w:t>
       </w:r>
       <w:r>
-        <w:t xml:space="preserve">, 2021</w:t>
-      </w:r>
-      <w:r>
-        <w:noBreakHyphen/>
-      </w:r>
-      <w:r>
-        <w:t xml:space="preserve">0512 (La. App. 4 Cir. 01/24/22) (“non-unanimous jury verdicts created an unacceptable risk and consequence of inaccurate, wrongful convictions.”);</w:t>
+        <w:t xml:space="preserve">, 2021-⁠0512 (La. App. 4 Cir. 01/24/22) (“non-unanimous jury verdicts created an unacceptable risk and consequence of inaccurate, wrongful convictions.”);</w:t>
       </w:r>
       <w:r>
         <w:t xml:space="preserve"> </w:t>
@@ -22475,13 +22337,7 @@
         <w:t xml:space="preserve">v. Melendez</w:t>
       </w:r>
       <w:r>
-        <w:t xml:space="preserve">, 2021</w:t>
-      </w:r>
-      <w:r>
-        <w:noBreakHyphen/>
-      </w:r>
-      <w:r>
-        <w:t xml:space="preserve">0597 (La. App. 4 Cir. 12/09/21). This Court need not follow</w:t>
+        <w:t xml:space="preserve">, 2021-⁠0597 (La. App. 4 Cir. 12/09/21). This Court need not follow</w:t>
       </w:r>
       <w:r>
         <w:t xml:space="preserve"> </w:t>
@@ -23252,13 +23108,7 @@
         <w:t xml:space="preserve">v. Waldron</w:t>
       </w:r>
       <w:r>
-        <w:t xml:space="preserve">, No. 2021</w:t>
-      </w:r>
-      <w:r>
-        <w:noBreakHyphen/>
-      </w:r>
-      <w:r>
-        <w:t xml:space="preserve">0512 (La. App. 4 Cir. 01/24/22) (“Louisiana has not abandoned the</w:t>
+        <w:t xml:space="preserve">, No. 2021-⁠0512 (La. App. 4 Cir. 01/24/22) (“Louisiana has not abandoned the</w:t>
       </w:r>
       <w:r>
         <w:t xml:space="preserve"> </w:t>
@@ -25261,13 +25111,7 @@
         <w:t xml:space="preserve">v. State</w:t>
       </w:r>
       <w:r>
-        <w:t xml:space="preserve">, 95</w:t>
-      </w:r>
-      <w:r>
-        <w:noBreakHyphen/>
-      </w:r>
-      <w:r>
-        <w:t xml:space="preserve">2385 (La. 07/02/96); 676 So.2d 87;</w:t>
+        <w:t xml:space="preserve">, 95-⁠2385 (La. 07/02/96); 676 So.2d 87;</w:t>
       </w:r>
       <w:r>
         <w:t xml:space="preserve"> </w:t>
@@ -25294,13 +25138,7 @@
         <w:t xml:space="preserve">v. Tate</w:t>
       </w:r>
       <w:r>
-        <w:t xml:space="preserve">, 12</w:t>
-      </w:r>
-      <w:r>
-        <w:noBreakHyphen/>
-      </w:r>
-      <w:r>
-        <w:t xml:space="preserve">2763 (La. 11/5/13); 130 So.3d 829.</w:t>
+        <w:t xml:space="preserve">, 12-⁠2763 (La. 11/5/13); 130 So.3d 829.</w:t>
       </w:r>
       <w:r>
         <w:rPr>
@@ -26533,13 +26371,7 @@
         <w:t xml:space="preserve">v. Granger</w:t>
       </w:r>
       <w:r>
-        <w:t xml:space="preserve">, 2007</w:t>
-      </w:r>
-      <w:r>
-        <w:noBreakHyphen/>
-      </w:r>
-      <w:r>
-        <w:t xml:space="preserve">2285 (La. 05/21/08); 982 So.2d 779, 787–88. In</w:t>
+        <w:t xml:space="preserve">, 2007-⁠2285 (La. 05/21/08); 982 So.2d 779, 787–88. In</w:t>
       </w:r>
       <w:r>
         <w:t xml:space="preserve"> </w:t>
@@ -26644,13 +26476,7 @@
         <w:t xml:space="preserve">v. RLCC Techs.</w:t>
       </w:r>
       <w:r>
-        <w:t xml:space="preserve">, 95</w:t>
-      </w:r>
-      <w:r>
-        <w:noBreakHyphen/>
-      </w:r>
-      <w:r>
-        <w:t xml:space="preserve">2621 (La. 02/28/96); 668 So.2d 1135, 1140 (“The second sentence [of Article I, § 3] uses absolute language, permitting no discrimination with respect to race or religion.”) (citing Lee</w:t>
+        <w:t xml:space="preserve">, 95-⁠2621 (La. 02/28/96); 668 So.2d 1135, 1140 (“The second sentence [of Article I, § 3] uses absolute language, permitting no discrimination with respect to race or religion.”) (citing Lee</w:t>
       </w:r>
       <w:r>
         <w:t xml:space="preserve"> </w:t>
@@ -26722,13 +26548,7 @@
         <w:t xml:space="preserve">v. Baxley</w:t>
       </w:r>
       <w:r>
-        <w:t xml:space="preserve">, 94</w:t>
-      </w:r>
-      <w:r>
-        <w:noBreakHyphen/>
-      </w:r>
-      <w:r>
-        <w:t xml:space="preserve">2982 (La. 05/22/95); 656 So.2d 973, 978.</w:t>
+        <w:t xml:space="preserve">, 94-⁠2982 (La. 05/22/95); 656 So.2d 973, 978.</w:t>
       </w:r>
     </w:p>
     <w:p>
@@ -26763,13 +26583,7 @@
         <w:t xml:space="preserve">Orleans v. Bd. of Comm’rs</w:t>
       </w:r>
       <w:r>
-        <w:t xml:space="preserve">, 93-C</w:t>
-      </w:r>
-      <w:r>
-        <w:noBreakHyphen/>
-      </w:r>
-      <w:r>
-        <w:t xml:space="preserve">0690 (La. 07/05/94); 640 So.2d 237, 256.</w:t>
+        <w:t xml:space="preserve">, 93-C-⁠0690 (La. 07/05/94); 640 So.2d 237, 256.</w:t>
       </w:r>
     </w:p>
     <w:p>
@@ -27566,13 +27380,7 @@
         <w:t xml:space="preserve">v. David Brown</w:t>
       </w:r>
       <w:r>
-        <w:t xml:space="preserve">, 16</w:t>
-      </w:r>
-      <w:r>
-        <w:noBreakHyphen/>
-      </w:r>
-      <w:r>
-        <w:t xml:space="preserve">0998 at 129 (La. 01/28/22).</w:t>
+        <w:t xml:space="preserve">, 16-⁠0998 at 129 (La. 01/28/22).</w:t>
       </w:r>
       <w:r>
         <w:rPr>
@@ -28095,13 +27903,7 @@
         <w:t xml:space="preserve">v. Gipson</w:t>
       </w:r>
       <w:r>
-        <w:t xml:space="preserve">, 2019</w:t>
-      </w:r>
-      <w:r>
-        <w:noBreakHyphen/>
-      </w:r>
-      <w:r>
-        <w:t xml:space="preserve">01815 (La. 06/03/20); 296 So. 3d 1051, 1057 (Johnson, J., dissenting) (internal citation omitted).</w:t>
+        <w:t xml:space="preserve">, 2019-⁠01815 (La. 06/03/20); 296 So. 3d 1051, 1057 (Johnson, J., dissenting) (internal citation omitted).</w:t>
       </w:r>
     </w:p>
     <w:p>
@@ -29083,11 +28885,7 @@
         <w:jc w:val="left"/>
       </w:pPr>
       <w:r>
-        <w:t xml:space="preserve">504</w:t>
-        <w:noBreakHyphen/>
-        <w:t xml:space="preserve">934</w:t>
-        <w:noBreakHyphen/>
-        <w:t xml:space="preserve">6715</w:t>
+        <w:t xml:space="preserve">504-⁠934-⁠6715</w:t>
       </w:r>
     </w:p>
     <w:p>
@@ -29248,11 +29046,7 @@
         <w:jc w:val="left"/>
       </w:pPr>
       <w:r>
-        <w:t xml:space="preserve">504</w:t>
-        <w:noBreakHyphen/>
-        <w:t xml:space="preserve">412</w:t>
-        <w:noBreakHyphen/>
-        <w:t xml:space="preserve">6001</w:t>
+        <w:t xml:space="preserve">504-⁠412-⁠6001</w:t>
       </w:r>
     </w:p>
     <w:p>
@@ -29543,11 +29337,7 @@
         <w:jc w:val="left"/>
       </w:pPr>
       <w:r>
-        <w:t xml:space="preserve">225</w:t>
-        <w:noBreakHyphen/>
-        <w:t xml:space="preserve">326</w:t>
-        <w:noBreakHyphen/>
-        <w:t xml:space="preserve">6705</w:t>
+        <w:t xml:space="preserve">225-⁠326-⁠6705</w:t>
       </w:r>
     </w:p>
     <w:p>
@@ -29760,11 +29550,7 @@
         <w:jc w:val="left"/>
       </w:pPr>
       <w:r>
-        <w:t xml:space="preserve">504</w:t>
-        <w:noBreakHyphen/>
-        <w:t xml:space="preserve">934</w:t>
-        <w:noBreakHyphen/>
-        <w:t xml:space="preserve">6630</w:t>
+        <w:t xml:space="preserve">504-⁠934-⁠6630</w:t>
       </w:r>
     </w:p>
     <w:p>
@@ -29989,11 +29775,7 @@
         <w:jc w:val="left"/>
       </w:pPr>
       <w:r>
-        <w:t xml:space="preserve">504</w:t>
-        <w:noBreakHyphen/>
-        <w:t xml:space="preserve">943</w:t>
-        <w:noBreakHyphen/>
-        <w:t xml:space="preserve">1902</w:t>
+        <w:t xml:space="preserve">504-⁠943-⁠1902</w:t>
       </w:r>
     </w:p>
     <w:p>
@@ -30148,11 +29930,7 @@
         <w:jc w:val="left"/>
       </w:pPr>
       <w:r>
-        <w:t xml:space="preserve">225</w:t>
-        <w:noBreakHyphen/>
-        <w:t xml:space="preserve">387</w:t>
-        <w:noBreakHyphen/>
-        <w:t xml:space="preserve">0237</w:t>
+        <w:t xml:space="preserve">225-⁠387-⁠0237</w:t>
       </w:r>
     </w:p>
     <w:p>
@@ -30731,13 +30509,7 @@
         <w:t xml:space="preserve">v. Maxie</w:t>
       </w:r>
       <w:r>
-        <w:t xml:space="preserve">, No. 13-CR</w:t>
-      </w:r>
-      <w:r>
-        <w:noBreakHyphen/>
-      </w:r>
-      <w:r>
-        <w:t xml:space="preserve">72522 (La. 11th Jud. Dist., Oct. 11, 2018)). Mr. Reddick submitted with his PCR Application the opinion from</w:t>
+        <w:t xml:space="preserve">, No. 13-CR-⁠72522 (La. 11th Jud. Dist., Oct. 11, 2018)). Mr. Reddick submitted with his PCR Application the opinion from</w:t>
       </w:r>
       <w:r>
         <w:t xml:space="preserve"> </w:t>
@@ -34678,13 +34450,7 @@
         <w:t xml:space="preserve">v. Ferreira</w:t>
       </w:r>
       <w:r>
-        <w:t xml:space="preserve">, 19</w:t>
-      </w:r>
-      <w:r>
-        <w:noBreakHyphen/>
-      </w:r>
-      <w:r>
-        <w:t xml:space="preserve">1929 (La. 10/14/20); 302 So.3d 1096. But</w:t>
+        <w:t xml:space="preserve">, 19-⁠1929 (La. 10/14/20); 302 So.3d 1096. But</w:t>
       </w:r>
       <w:r>
         <w:t xml:space="preserve"> </w:t>
@@ -35240,13 +35006,7 @@
         <w:t xml:space="preserve">v. Dotson</w:t>
       </w:r>
       <w:r>
-        <w:t xml:space="preserve">, 2019</w:t>
-      </w:r>
-      <w:r>
-        <w:noBreakHyphen/>
-      </w:r>
-      <w:r>
-        <w:t xml:space="preserve">01828 (La. 06/03/20); 296 So.3d 1059;</w:t>
+        <w:t xml:space="preserve">, 2019-⁠01828 (La. 06/03/20); 296 So.3d 1059;</w:t>
       </w:r>
       <w:r>
         <w:t xml:space="preserve"> </w:t>
@@ -35273,13 +35033,7 @@
         <w:t xml:space="preserve">v. Cook</w:t>
       </w:r>
       <w:r>
-        <w:t xml:space="preserve">, 2020</w:t>
-      </w:r>
-      <w:r>
-        <w:noBreakHyphen/>
-      </w:r>
-      <w:r>
-        <w:t xml:space="preserve">00001 (La. 08/14/20); 300 So.3d 838;</w:t>
+        <w:t xml:space="preserve">, 2020-⁠00001 (La. 08/14/20); 300 So.3d 838;</w:t>
       </w:r>
       <w:r>
         <w:t xml:space="preserve"> </w:t>
@@ -35306,13 +35060,7 @@
         <w:t xml:space="preserve">v. Parish</w:t>
       </w:r>
       <w:r>
-        <w:t xml:space="preserve">, 2020</w:t>
-      </w:r>
-      <w:r>
-        <w:noBreakHyphen/>
-      </w:r>
-      <w:r>
-        <w:t xml:space="preserve">00072 (La. 08/14/20); 300 So.3d 861;</w:t>
+        <w:t xml:space="preserve">, 2020-⁠00072 (La. 08/14/20); 300 So.3d 861;</w:t>
       </w:r>
       <w:r>
         <w:t xml:space="preserve"> </w:t>
@@ -35339,13 +35087,7 @@
         <w:t xml:space="preserve">v. McGuire</w:t>
       </w:r>
       <w:r>
-        <w:t xml:space="preserve">, 2019</w:t>
-      </w:r>
-      <w:r>
-        <w:noBreakHyphen/>
-      </w:r>
-      <w:r>
-        <w:t xml:space="preserve">01632 (La. 08/14/20); 300 So.3d 830;</w:t>
+        <w:t xml:space="preserve">, 2019-⁠01632 (La. 08/14/20); 300 So.3d 830;</w:t>
       </w:r>
       <w:r>
         <w:t xml:space="preserve"> </w:t>
@@ -35372,13 +35114,7 @@
         <w:t xml:space="preserve">v. Johnson</w:t>
       </w:r>
       <w:r>
-        <w:t xml:space="preserve">, 2019</w:t>
-      </w:r>
-      <w:r>
-        <w:noBreakHyphen/>
-      </w:r>
-      <w:r>
-        <w:t xml:space="preserve">02075 (La. 08/14/20); 300 So.3d 858;</w:t>
+        <w:t xml:space="preserve">, 2019-⁠02075 (La. 08/14/20); 300 So.3d 858;</w:t>
       </w:r>
       <w:r>
         <w:t xml:space="preserve"> </w:t>
@@ -35405,13 +35141,7 @@
         <w:t xml:space="preserve">v. Spencer</w:t>
       </w:r>
       <w:r>
-        <w:t xml:space="preserve">, 2019</w:t>
-      </w:r>
-      <w:r>
-        <w:noBreakHyphen/>
-      </w:r>
-      <w:r>
-        <w:t xml:space="preserve">01318 (La. 08/14/20); 300 So.3d 855;</w:t>
+        <w:t xml:space="preserve">, 2019-⁠01318 (La. 08/14/20); 300 So.3d 855;</w:t>
       </w:r>
       <w:r>
         <w:t xml:space="preserve"> </w:t>
@@ -35438,13 +35168,7 @@
         <w:t xml:space="preserve">v. Williams</w:t>
       </w:r>
       <w:r>
-        <w:t xml:space="preserve">, 2020</w:t>
-      </w:r>
-      <w:r>
-        <w:noBreakHyphen/>
-      </w:r>
-      <w:r>
-        <w:t xml:space="preserve">00069 (La. 08/14/20); 300 So.3d 860;</w:t>
+        <w:t xml:space="preserve">, 2020-⁠00069 (La. 08/14/20); 300 So.3d 860;</w:t>
       </w:r>
       <w:r>
         <w:t xml:space="preserve"> </w:t>
@@ -35471,13 +35195,7 @@
         <w:t xml:space="preserve">v. Withers</w:t>
       </w:r>
       <w:r>
-        <w:t xml:space="preserve">, 2020</w:t>
-      </w:r>
-      <w:r>
-        <w:noBreakHyphen/>
-      </w:r>
-      <w:r>
-        <w:t xml:space="preserve">00258 (La. 08/14/20); 300 So.3d 860;</w:t>
+        <w:t xml:space="preserve">, 2020-⁠00258 (La. 08/14/20); 300 So.3d 860;</w:t>
       </w:r>
       <w:r>
         <w:t xml:space="preserve"> </w:t>
@@ -35504,13 +35222,7 @@
         <w:t xml:space="preserve">v. Wardlaw</w:t>
       </w:r>
       <w:r>
-        <w:t xml:space="preserve">, 2020</w:t>
-      </w:r>
-      <w:r>
-        <w:noBreakHyphen/>
-      </w:r>
-      <w:r>
-        <w:t xml:space="preserve">00004 (La. 08/14/20); 300 So.3d 859;</w:t>
+        <w:t xml:space="preserve">, 2020-⁠00004 (La. 08/14/20); 300 So.3d 859;</w:t>
       </w:r>
       <w:r>
         <w:t xml:space="preserve"> </w:t>
@@ -35537,13 +35249,7 @@
         <w:t xml:space="preserve">v. Sonnier</w:t>
       </w:r>
       <w:r>
-        <w:t xml:space="preserve">, 2019</w:t>
-      </w:r>
-      <w:r>
-        <w:noBreakHyphen/>
-      </w:r>
-      <w:r>
-        <w:t xml:space="preserve">02066 (La. 08/14/20); 300 So.3d 857;</w:t>
+        <w:t xml:space="preserve">, 2019-⁠02066 (La. 08/14/20); 300 So.3d 857;</w:t>
       </w:r>
       <w:r>
         <w:t xml:space="preserve"> </w:t>
@@ -35570,13 +35276,7 @@
         <w:t xml:space="preserve">v. Pittman</w:t>
       </w:r>
       <w:r>
-        <w:t xml:space="preserve">, 2019</w:t>
-      </w:r>
-      <w:r>
-        <w:noBreakHyphen/>
-      </w:r>
-      <w:r>
-        <w:t xml:space="preserve">01354 (La. 08/14/20); 300 So.3d 856;</w:t>
+        <w:t xml:space="preserve">, 2019-⁠01354 (La. 08/14/20); 300 So.3d 856;</w:t>
       </w:r>
       <w:r>
         <w:t xml:space="preserve"> </w:t>
@@ -35603,13 +35303,7 @@
         <w:t xml:space="preserve">v. Carter</w:t>
       </w:r>
       <w:r>
-        <w:t xml:space="preserve">, 2019</w:t>
-      </w:r>
-      <w:r>
-        <w:noBreakHyphen/>
-      </w:r>
-      <w:r>
-        <w:t xml:space="preserve">02053 (La. 08/14/20); 300 So.3d 856;</w:t>
+        <w:t xml:space="preserve">, 2019-⁠02053 (La. 08/14/20); 300 So.3d 856;</w:t>
       </w:r>
       <w:r>
         <w:t xml:space="preserve"> </w:t>
@@ -35636,13 +35330,7 @@
         <w:t xml:space="preserve">v. Eaglin</w:t>
       </w:r>
       <w:r>
-        <w:t xml:space="preserve">, 2019</w:t>
-      </w:r>
-      <w:r>
-        <w:noBreakHyphen/>
-      </w:r>
-      <w:r>
-        <w:t xml:space="preserve">01952 (La. 08/14/20); 300 So.3d 840;</w:t>
+        <w:t xml:space="preserve">, 2019-⁠01952 (La. 08/14/20); 300 So.3d 840;</w:t>
       </w:r>
       <w:r>
         <w:t xml:space="preserve"> </w:t>
@@ -35669,13 +35357,7 @@
         <w:t xml:space="preserve">v. Kidd</w:t>
       </w:r>
       <w:r>
-        <w:t xml:space="preserve">, 2020</w:t>
-      </w:r>
-      <w:r>
-        <w:noBreakHyphen/>
-      </w:r>
-      <w:r>
-        <w:t xml:space="preserve">00055 (La. 08/14/20); 300 So.3d 828;</w:t>
+        <w:t xml:space="preserve">, 2020-⁠00055 (La. 08/14/20); 300 So.3d 828;</w:t>
       </w:r>
       <w:r>
         <w:t xml:space="preserve"> </w:t>
@@ -35702,13 +35384,7 @@
         <w:t xml:space="preserve">v. Skipper</w:t>
       </w:r>
       <w:r>
-        <w:t xml:space="preserve">, 2020</w:t>
-      </w:r>
-      <w:r>
-        <w:noBreakHyphen/>
-      </w:r>
-      <w:r>
-        <w:t xml:space="preserve">00280 (La. 09/08/20); 301 So.3d 16;</w:t>
+        <w:t xml:space="preserve">, 2020-⁠00280 (La. 09/08/20); 301 So.3d 16;</w:t>
       </w:r>
       <w:r>
         <w:t xml:space="preserve"> </w:t>
@@ -35762,13 +35438,7 @@
         <w:t xml:space="preserve">v. Hawthorne</w:t>
       </w:r>
       <w:r>
-        <w:t xml:space="preserve">, 2020</w:t>
-      </w:r>
-      <w:r>
-        <w:noBreakHyphen/>
-      </w:r>
-      <w:r>
-        <w:t xml:space="preserve">00586 (La. 09/29/20), 2020 WL 5793105;</w:t>
+        <w:t xml:space="preserve">, 2020-⁠00586 (La. 09/29/20), 2020 WL 5793105;</w:t>
       </w:r>
       <w:r>
         <w:t xml:space="preserve"> </w:t>
@@ -35795,13 +35465,7 @@
         <w:t xml:space="preserve">v. Johnson</w:t>
       </w:r>
       <w:r>
-        <w:t xml:space="preserve">, 2020</w:t>
-      </w:r>
-      <w:r>
-        <w:noBreakHyphen/>
-      </w:r>
-      <w:r>
-        <w:t xml:space="preserve">00052 (La. 09/29/20), 2020 WL 5793805;</w:t>
+        <w:t xml:space="preserve">, 2020-⁠00052 (La. 09/29/20), 2020 WL 5793805;</w:t>
       </w:r>
       <w:r>
         <w:t xml:space="preserve"> </w:t>
@@ -35828,13 +35492,7 @@
         <w:t xml:space="preserve">v. Vannoy</w:t>
       </w:r>
       <w:r>
-        <w:t xml:space="preserve">, 2019</w:t>
-      </w:r>
-      <w:r>
-        <w:noBreakHyphen/>
-      </w:r>
-      <w:r>
-        <w:t xml:space="preserve">01861 (La. 06/03/20); 296 So.3d 1033;</w:t>
+        <w:t xml:space="preserve">, 2019-⁠01861 (La. 06/03/20); 296 So.3d 1033;</w:t>
       </w:r>
       <w:r>
         <w:t xml:space="preserve"> </w:t>
@@ -35861,13 +35519,7 @@
         <w:t xml:space="preserve">v. State</w:t>
       </w:r>
       <w:r>
-        <w:t xml:space="preserve">, 2019</w:t>
-      </w:r>
-      <w:r>
-        <w:noBreakHyphen/>
-      </w:r>
-      <w:r>
-        <w:t xml:space="preserve">01900 (La. 06/03/20); 296 So. 3d 1060;</w:t>
+        <w:t xml:space="preserve">, 2019-⁠01900 (La. 06/03/20); 296 So. 3d 1060;</w:t>
       </w:r>
       <w:r>
         <w:t xml:space="preserve"> </w:t>
@@ -35894,13 +35546,7 @@
         <w:t xml:space="preserve">v. Brown</w:t>
       </w:r>
       <w:r>
-        <w:t xml:space="preserve">, 2020</w:t>
-      </w:r>
-      <w:r>
-        <w:noBreakHyphen/>
-      </w:r>
-      <w:r>
-        <w:t xml:space="preserve">00276 (La. 06/22/20); 297 So.3d 721;</w:t>
+        <w:t xml:space="preserve">, 2020-⁠00276 (La. 06/22/20); 297 So.3d 721;</w:t>
       </w:r>
       <w:r>
         <w:t xml:space="preserve"> </w:t>
@@ -35927,13 +35573,7 @@
         <w:t xml:space="preserve">v. Vannoy</w:t>
       </w:r>
       <w:r>
-        <w:t xml:space="preserve">, 2019</w:t>
-      </w:r>
-      <w:r>
-        <w:noBreakHyphen/>
-      </w:r>
-      <w:r>
-        <w:t xml:space="preserve">01794 (La. 07/24/20); 299 So.3d 54;</w:t>
+        <w:t xml:space="preserve">, 2019-⁠01794 (La. 07/24/20); 299 So.3d 54;</w:t>
       </w:r>
       <w:r>
         <w:t xml:space="preserve"> </w:t>
@@ -35960,13 +35600,7 @@
         <w:t xml:space="preserve">v. State</w:t>
       </w:r>
       <w:r>
-        <w:t xml:space="preserve">, 2020</w:t>
-      </w:r>
-      <w:r>
-        <w:noBreakHyphen/>
-      </w:r>
-      <w:r>
-        <w:t xml:space="preserve">01989 (La. 08/14/20); 300 So.3d 824;</w:t>
+        <w:t xml:space="preserve">, 2020-⁠01989 (La. 08/14/20); 300 So.3d 824;</w:t>
       </w:r>
       <w:r>
         <w:t xml:space="preserve"> </w:t>
@@ -35993,13 +35627,7 @@
         <w:t xml:space="preserve">v. State</w:t>
       </w:r>
       <w:r>
-        <w:t xml:space="preserve">, 2019</w:t>
-      </w:r>
-      <w:r>
-        <w:noBreakHyphen/>
-      </w:r>
-      <w:r>
-        <w:t xml:space="preserve">02074 (La. 08/14/20); 300 So.3d 858;</w:t>
+        <w:t xml:space="preserve">, 2019-⁠02074 (La. 08/14/20); 300 So.3d 858;</w:t>
       </w:r>
       <w:r>
         <w:t xml:space="preserve"> </w:t>
@@ -36026,13 +35654,7 @@
         <w:t xml:space="preserve">v. Vannoy</w:t>
       </w:r>
       <w:r>
-        <w:t xml:space="preserve">, 2019</w:t>
-      </w:r>
-      <w:r>
-        <w:noBreakHyphen/>
-      </w:r>
-      <w:r>
-        <w:t xml:space="preserve">02034 (La. 08/14/20); 300 So.3d 857;</w:t>
+        <w:t xml:space="preserve">, 2019-⁠02034 (La. 08/14/20); 300 So.3d 857;</w:t>
       </w:r>
       <w:r>
         <w:t xml:space="preserve"> </w:t>
@@ -36059,13 +35681,7 @@
         <w:t xml:space="preserve">v. Harris</w:t>
       </w:r>
       <w:r>
-        <w:t xml:space="preserve">, 2020</w:t>
-      </w:r>
-      <w:r>
-        <w:noBreakHyphen/>
-      </w:r>
-      <w:r>
-        <w:t xml:space="preserve">00291 (La. 09/08/20); 301 So.3d 13;</w:t>
+        <w:t xml:space="preserve">, 2020-⁠00291 (La. 09/08/20); 301 So.3d 13;</w:t>
       </w:r>
       <w:r>
         <w:t xml:space="preserve"> </w:t>
@@ -36092,13 +35708,7 @@
         <w:t xml:space="preserve">v. Smith</w:t>
       </w:r>
       <w:r>
-        <w:t xml:space="preserve">, 2020</w:t>
-      </w:r>
-      <w:r>
-        <w:noBreakHyphen/>
-      </w:r>
-      <w:r>
-        <w:t xml:space="preserve">00621 (La. 09/29/20), 2020 WL 5793717;</w:t>
+        <w:t xml:space="preserve">, 2020-⁠00621 (La. 09/29/20), 2020 WL 5793717;</w:t>
       </w:r>
       <w:r>
         <w:t xml:space="preserve"> </w:t>
@@ -36125,13 +35735,7 @@
         <w:t xml:space="preserve">v. State</w:t>
       </w:r>
       <w:r>
-        <w:t xml:space="preserve">, 2020</w:t>
-      </w:r>
-      <w:r>
-        <w:noBreakHyphen/>
-      </w:r>
-      <w:r>
-        <w:t xml:space="preserve">00268 (La. 10/06/20), 2020 WL 5904873;</w:t>
+        <w:t xml:space="preserve">, 2020-⁠00268 (La. 10/06/20), 2020 WL 5904873;</w:t>
       </w:r>
       <w:r>
         <w:t xml:space="preserve"> </w:t>
@@ -36158,13 +35762,7 @@
         <w:t xml:space="preserve">v. Vannoy</w:t>
       </w:r>
       <w:r>
-        <w:t xml:space="preserve">, 2020</w:t>
-      </w:r>
-      <w:r>
-        <w:noBreakHyphen/>
-      </w:r>
-      <w:r>
-        <w:t xml:space="preserve">00020 (La. 10/06/20), 2020 WL 5905099;</w:t>
+        <w:t xml:space="preserve">, 2020-⁠00020 (La. 10/06/20), 2020 WL 5905099;</w:t>
       </w:r>
       <w:r>
         <w:t xml:space="preserve"> </w:t>
@@ -36191,13 +35789,7 @@
         <w:t xml:space="preserve">v. Barrett</w:t>
       </w:r>
       <w:r>
-        <w:t xml:space="preserve">, 2019</w:t>
-      </w:r>
-      <w:r>
-        <w:noBreakHyphen/>
-      </w:r>
-      <w:r>
-        <w:t xml:space="preserve">01718 (La. 08/14/20); 300 So.3d 827;</w:t>
+        <w:t xml:space="preserve">, 2019-⁠01718 (La. 08/14/20); 300 So.3d 827;</w:t>
       </w:r>
       <w:r>
         <w:t xml:space="preserve"> </w:t>
@@ -36224,13 +35816,7 @@
         <w:t xml:space="preserve">v. Mason</w:t>
       </w:r>
       <w:r>
-        <w:t xml:space="preserve">, 2019</w:t>
-      </w:r>
-      <w:r>
-        <w:noBreakHyphen/>
-      </w:r>
-      <w:r>
-        <w:t xml:space="preserve">01821 (La. 08/14/20), 2020 WL 4726952;</w:t>
+        <w:t xml:space="preserve">, 2019-⁠01821 (La. 08/14/20), 2020 WL 4726952;</w:t>
       </w:r>
       <w:r>
         <w:t xml:space="preserve"> </w:t>
@@ -36257,13 +35843,7 @@
         <w:t xml:space="preserve">v. Mims</w:t>
       </w:r>
       <w:r>
-        <w:t xml:space="preserve">, 2019</w:t>
-      </w:r>
-      <w:r>
-        <w:noBreakHyphen/>
-      </w:r>
-      <w:r>
-        <w:t xml:space="preserve">2088 (La. 08/14/20); 300 So.3d 867;</w:t>
+        <w:t xml:space="preserve">, 2019-⁠2088 (La. 08/14/20); 300 So.3d 867;</w:t>
       </w:r>
       <w:r>
         <w:t xml:space="preserve"> </w:t>
@@ -36290,13 +35870,7 @@
         <w:t xml:space="preserve">v. Williams</w:t>
       </w:r>
       <w:r>
-        <w:t xml:space="preserve">, 2019</w:t>
-      </w:r>
-      <w:r>
-        <w:noBreakHyphen/>
-      </w:r>
-      <w:r>
-        <w:t xml:space="preserve">02010 (La. 08/14/20); 300 So.3d 856.</w:t>
+        <w:t xml:space="preserve">, 2019-⁠02010 (La. 08/14/20); 300 So.3d 856.</w:t>
       </w:r>
     </w:p>
   </w:footnote>
@@ -36336,13 +35910,7 @@
         <w:t xml:space="preserve">v. Young</w:t>
       </w:r>
       <w:r>
-        <w:t xml:space="preserve">, 2019</w:t>
-      </w:r>
-      <w:r>
-        <w:noBreakHyphen/>
-      </w:r>
-      <w:r>
-        <w:t xml:space="preserve">01818 (La. 06/12/20), 2020 WL 3424876;</w:t>
+        <w:t xml:space="preserve">, 2019-⁠01818 (La. 06/12/20), 2020 WL 3424876;</w:t>
       </w:r>
       <w:r>
         <w:t xml:space="preserve"> </w:t>
@@ -36369,13 +35937,7 @@
         <w:t xml:space="preserve">v. Brooks</w:t>
       </w:r>
       <w:r>
-        <w:t xml:space="preserve">, 2020</w:t>
-      </w:r>
-      <w:r>
-        <w:noBreakHyphen/>
-      </w:r>
-      <w:r>
-        <w:t xml:space="preserve">00378 (La. 10/14/20), 2020 WL 6059695.</w:t>
+        <w:t xml:space="preserve">, 2020-⁠00378 (La. 10/14/20), 2020 WL 6059695.</w:t>
       </w:r>
     </w:p>
   </w:footnote>
@@ -36415,13 +35977,7 @@
         <w:t xml:space="preserve">v. McKnight</w:t>
       </w:r>
       <w:r>
-        <w:t xml:space="preserve">, 2020</w:t>
-      </w:r>
-      <w:r>
-        <w:noBreakHyphen/>
-      </w:r>
-      <w:r>
-        <w:t xml:space="preserve">00873 (La. 07/17/20); 299 So.3d 64.</w:t>
+        <w:t xml:space="preserve">, 2020-⁠00873 (La. 07/17/20); 299 So.3d 64.</w:t>
       </w:r>
     </w:p>
   </w:footnote>
@@ -36501,13 +36057,7 @@
         <w:t xml:space="preserve">v. Dotson</w:t>
       </w:r>
       <w:r>
-        <w:t xml:space="preserve">, 2019</w:t>
-      </w:r>
-      <w:r>
-        <w:noBreakHyphen/>
-      </w:r>
-      <w:r>
-        <w:t xml:space="preserve">01828 (La. 06/03/20); 296 So.3d 1059;</w:t>
+        <w:t xml:space="preserve">, 2019-⁠01828 (La. 06/03/20); 296 So.3d 1059;</w:t>
       </w:r>
       <w:r>
         <w:t xml:space="preserve"> </w:t>
@@ -36534,13 +36084,7 @@
         <w:t xml:space="preserve">v. Cook</w:t>
       </w:r>
       <w:r>
-        <w:t xml:space="preserve">, 2020</w:t>
-      </w:r>
-      <w:r>
-        <w:noBreakHyphen/>
-      </w:r>
-      <w:r>
-        <w:t xml:space="preserve">00001 (La. 08/14/20); 300 So.3d 838;</w:t>
+        <w:t xml:space="preserve">, 2020-⁠00001 (La. 08/14/20); 300 So.3d 838;</w:t>
       </w:r>
       <w:r>
         <w:t xml:space="preserve"> </w:t>
@@ -36567,13 +36111,7 @@
         <w:t xml:space="preserve">v. Parish</w:t>
       </w:r>
       <w:r>
-        <w:t xml:space="preserve">, 2020</w:t>
-      </w:r>
-      <w:r>
-        <w:noBreakHyphen/>
-      </w:r>
-      <w:r>
-        <w:t xml:space="preserve">00072 (La. 08/14/20); 300 So.3d 861;</w:t>
+        <w:t xml:space="preserve">, 2020-⁠00072 (La. 08/14/20); 300 So.3d 861;</w:t>
       </w:r>
       <w:r>
         <w:t xml:space="preserve"> </w:t>
@@ -36600,13 +36138,7 @@
         <w:t xml:space="preserve">v. McGuire</w:t>
       </w:r>
       <w:r>
-        <w:t xml:space="preserve">, 2019</w:t>
-      </w:r>
-      <w:r>
-        <w:noBreakHyphen/>
-      </w:r>
-      <w:r>
-        <w:t xml:space="preserve">01632 (La. 08/14/20); 300 So.3d 830;</w:t>
+        <w:t xml:space="preserve">, 2019-⁠01632 (La. 08/14/20); 300 So.3d 830;</w:t>
       </w:r>
       <w:r>
         <w:t xml:space="preserve"> </w:t>
@@ -36633,13 +36165,7 @@
         <w:t xml:space="preserve">v. Withers</w:t>
       </w:r>
       <w:r>
-        <w:t xml:space="preserve">, 2020</w:t>
-      </w:r>
-      <w:r>
-        <w:noBreakHyphen/>
-      </w:r>
-      <w:r>
-        <w:t xml:space="preserve">00258 (La. 08/14/20); 300 So.3d 860;</w:t>
+        <w:t xml:space="preserve">, 2020-⁠00258 (La. 08/14/20); 300 So.3d 860;</w:t>
       </w:r>
       <w:r>
         <w:t xml:space="preserve"> </w:t>
@@ -36666,13 +36192,7 @@
         <w:t xml:space="preserve">v. Sonnier</w:t>
       </w:r>
       <w:r>
-        <w:t xml:space="preserve">, 2019</w:t>
-      </w:r>
-      <w:r>
-        <w:noBreakHyphen/>
-      </w:r>
-      <w:r>
-        <w:t xml:space="preserve">02066 (La. 08/14/20); 300 So.3d 857;</w:t>
+        <w:t xml:space="preserve">, 2019-⁠02066 (La. 08/14/20); 300 So.3d 857;</w:t>
       </w:r>
       <w:r>
         <w:t xml:space="preserve"> </w:t>
@@ -36699,13 +36219,7 @@
         <w:t xml:space="preserve">v. Carter</w:t>
       </w:r>
       <w:r>
-        <w:t xml:space="preserve">, 2019</w:t>
-      </w:r>
-      <w:r>
-        <w:noBreakHyphen/>
-      </w:r>
-      <w:r>
-        <w:t xml:space="preserve">02053 (La. 08/14/20); 300 So.3d 856;</w:t>
+        <w:t xml:space="preserve">, 2019-⁠02053 (La. 08/14/20); 300 So.3d 856;</w:t>
       </w:r>
       <w:r>
         <w:t xml:space="preserve"> </w:t>
@@ -36732,13 +36246,7 @@
         <w:t xml:space="preserve">v. Eaglin</w:t>
       </w:r>
       <w:r>
-        <w:t xml:space="preserve">, 2019</w:t>
-      </w:r>
-      <w:r>
-        <w:noBreakHyphen/>
-      </w:r>
-      <w:r>
-        <w:t xml:space="preserve">01952 (La. 08/14/20); 300 So.3d 840;</w:t>
+        <w:t xml:space="preserve">, 2019-⁠01952 (La. 08/14/20); 300 So.3d 840;</w:t>
       </w:r>
       <w:r>
         <w:t xml:space="preserve"> </w:t>
@@ -36765,13 +36273,7 @@
         <w:t xml:space="preserve">v. Kidd</w:t>
       </w:r>
       <w:r>
-        <w:t xml:space="preserve">, 2020</w:t>
-      </w:r>
-      <w:r>
-        <w:noBreakHyphen/>
-      </w:r>
-      <w:r>
-        <w:t xml:space="preserve">00055 (La. 08/14/20); 300 So.3d 828;</w:t>
+        <w:t xml:space="preserve">, 2020-⁠00055 (La. 08/14/20); 300 So.3d 828;</w:t>
       </w:r>
       <w:r>
         <w:t xml:space="preserve"> </w:t>
@@ -36798,13 +36300,7 @@
         <w:t xml:space="preserve">v. Sims</w:t>
       </w:r>
       <w:r>
-        <w:t xml:space="preserve">, 2020</w:t>
-      </w:r>
-      <w:r>
-        <w:noBreakHyphen/>
-      </w:r>
-      <w:r>
-        <w:t xml:space="preserve">00298 (La. 09/08/20); 301 So.3d 17;</w:t>
+        <w:t xml:space="preserve">, 2020-⁠00298 (La. 09/08/20); 301 So.3d 17;</w:t>
       </w:r>
       <w:r>
         <w:t xml:space="preserve"> </w:t>
@@ -36831,13 +36327,7 @@
         <w:t xml:space="preserve">v. Johnson</w:t>
       </w:r>
       <w:r>
-        <w:t xml:space="preserve">, 2020</w:t>
-      </w:r>
-      <w:r>
-        <w:noBreakHyphen/>
-      </w:r>
-      <w:r>
-        <w:t xml:space="preserve">00052 (La. 09/29/20), 2020 WL 5793805;</w:t>
+        <w:t xml:space="preserve">, 2020-⁠00052 (La. 09/29/20), 2020 WL 5793805;</w:t>
       </w:r>
       <w:r>
         <w:t xml:space="preserve"> </w:t>
@@ -36864,13 +36354,7 @@
         <w:t xml:space="preserve">v. Mason</w:t>
       </w:r>
       <w:r>
-        <w:t xml:space="preserve">, 2019</w:t>
-      </w:r>
-      <w:r>
-        <w:noBreakHyphen/>
-      </w:r>
-      <w:r>
-        <w:t xml:space="preserve">01821 (La. 08/14/20), 2020 WL 4726952;</w:t>
+        <w:t xml:space="preserve">, 2019-⁠01821 (La. 08/14/20), 2020 WL 4726952;</w:t>
       </w:r>
       <w:r>
         <w:t xml:space="preserve"> </w:t>
@@ -36897,13 +36381,7 @@
         <w:t xml:space="preserve">v. Williams</w:t>
       </w:r>
       <w:r>
-        <w:t xml:space="preserve">, 2019</w:t>
-      </w:r>
-      <w:r>
-        <w:noBreakHyphen/>
-      </w:r>
-      <w:r>
-        <w:t xml:space="preserve">02010 (La. 08/14/20); 300 So.3d 856;</w:t>
+        <w:t xml:space="preserve">, 2019-⁠02010 (La. 08/14/20); 300 So.3d 856;</w:t>
       </w:r>
       <w:r>
         <w:t xml:space="preserve"> </w:t>
@@ -36930,13 +36408,7 @@
         <w:t xml:space="preserve">v. State</w:t>
       </w:r>
       <w:r>
-        <w:t xml:space="preserve">, 2019</w:t>
-      </w:r>
-      <w:r>
-        <w:noBreakHyphen/>
-      </w:r>
-      <w:r>
-        <w:t xml:space="preserve">01900 (La. 06/03/20); 296 So. 3d 1060;</w:t>
+        <w:t xml:space="preserve">, 2019-⁠01900 (La. 06/03/20); 296 So. 3d 1060;</w:t>
       </w:r>
       <w:r>
         <w:t xml:space="preserve"> </w:t>
@@ -36963,13 +36435,7 @@
         <w:t xml:space="preserve">v. Vannoy</w:t>
       </w:r>
       <w:r>
-        <w:t xml:space="preserve">, 2019</w:t>
-      </w:r>
-      <w:r>
-        <w:noBreakHyphen/>
-      </w:r>
-      <w:r>
-        <w:t xml:space="preserve">01861 (La. 06/03/20); 296 So.3d 1033.</w:t>
+        <w:t xml:space="preserve">, 2019-⁠01861 (La. 06/03/20); 296 So.3d 1033.</w:t>
       </w:r>
     </w:p>
   </w:footnote>
@@ -37009,13 +36475,7 @@
         <w:t xml:space="preserve">Jones v. State</w:t>
       </w:r>
       <w:r>
-        <w:t xml:space="preserve">, 2019</w:t>
-      </w:r>
-      <w:r>
-        <w:noBreakHyphen/>
-      </w:r>
-      <w:r>
-        <w:t xml:space="preserve">01900 (La. 06/03/20); 296 So. 3d 1060;</w:t>
+        <w:t xml:space="preserve">, 2019-⁠01900 (La. 06/03/20); 296 So. 3d 1060;</w:t>
       </w:r>
       <w:r>
         <w:t xml:space="preserve"> </w:t>
@@ -37042,13 +36502,7 @@
         <w:t xml:space="preserve">v. Young</w:t>
       </w:r>
       <w:r>
-        <w:t xml:space="preserve">, 2019</w:t>
-      </w:r>
-      <w:r>
-        <w:noBreakHyphen/>
-      </w:r>
-      <w:r>
-        <w:t xml:space="preserve">01818 (La. 06/12/20), 2020 WL 3424876;</w:t>
+        <w:t xml:space="preserve">, 2019-⁠01818 (La. 06/12/20), 2020 WL 3424876;</w:t>
       </w:r>
       <w:r>
         <w:t xml:space="preserve"> </w:t>
@@ -37075,13 +36529,7 @@
         <w:t xml:space="preserve">v. Brown</w:t>
       </w:r>
       <w:r>
-        <w:t xml:space="preserve">, 2020</w:t>
-      </w:r>
-      <w:r>
-        <w:noBreakHyphen/>
-      </w:r>
-      <w:r>
-        <w:t xml:space="preserve">00276 (La. 06/22/20); 297 So.3d 721;</w:t>
+        <w:t xml:space="preserve">, 2020-⁠00276 (La. 06/22/20); 297 So.3d 721;</w:t>
       </w:r>
       <w:r>
         <w:t xml:space="preserve"> </w:t>
@@ -37108,13 +36556,7 @@
         <w:t xml:space="preserve">v. Vannoy</w:t>
       </w:r>
       <w:r>
-        <w:t xml:space="preserve">, 2019</w:t>
-      </w:r>
-      <w:r>
-        <w:noBreakHyphen/>
-      </w:r>
-      <w:r>
-        <w:t xml:space="preserve">01794 (La. 07/24/20); 299 So.3d 54;</w:t>
+        <w:t xml:space="preserve">, 2019-⁠01794 (La. 07/24/20); 299 So.3d 54;</w:t>
       </w:r>
       <w:r>
         <w:t xml:space="preserve"> </w:t>
@@ -37141,13 +36583,7 @@
         <w:t xml:space="preserve">v. State</w:t>
       </w:r>
       <w:r>
-        <w:t xml:space="preserve">, 2019</w:t>
-      </w:r>
-      <w:r>
-        <w:noBreakHyphen/>
-      </w:r>
-      <w:r>
-        <w:t xml:space="preserve">02074 (La. 08/14/20); 300 So.3d 858;</w:t>
+        <w:t xml:space="preserve">, 2019-⁠02074 (La. 08/14/20); 300 So.3d 858;</w:t>
       </w:r>
       <w:r>
         <w:t xml:space="preserve"> </w:t>
@@ -37174,13 +36610,7 @@
         <w:t xml:space="preserve">v. Vannoy</w:t>
       </w:r>
       <w:r>
-        <w:t xml:space="preserve">, 2019</w:t>
-      </w:r>
-      <w:r>
-        <w:noBreakHyphen/>
-      </w:r>
-      <w:r>
-        <w:t xml:space="preserve">02034 (La. 08/14/20); 300 So.3d 857;</w:t>
+        <w:t xml:space="preserve">, 2019-⁠02034 (La. 08/14/20); 300 So.3d 857;</w:t>
       </w:r>
       <w:r>
         <w:t xml:space="preserve"> </w:t>
@@ -37207,13 +36637,7 @@
         <w:t xml:space="preserve">v. Vannoy</w:t>
       </w:r>
       <w:r>
-        <w:t xml:space="preserve">, 2020</w:t>
-      </w:r>
-      <w:r>
-        <w:noBreakHyphen/>
-      </w:r>
-      <w:r>
-        <w:t xml:space="preserve">00020 (La. 10/06/20), 2020 WL 5905099;</w:t>
+        <w:t xml:space="preserve">, 2020-⁠00020 (La. 10/06/20), 2020 WL 5905099;</w:t>
       </w:r>
       <w:r>
         <w:t xml:space="preserve"> </w:t>
@@ -37240,13 +36664,7 @@
         <w:t xml:space="preserve">v. Barrett</w:t>
       </w:r>
       <w:r>
-        <w:t xml:space="preserve">, 2019</w:t>
-      </w:r>
-      <w:r>
-        <w:noBreakHyphen/>
-      </w:r>
-      <w:r>
-        <w:t xml:space="preserve">01718 (La. 08/14/20); 300 So.3d 827;</w:t>
+        <w:t xml:space="preserve">, 2019-⁠01718 (La. 08/14/20); 300 So.3d 827;</w:t>
       </w:r>
       <w:r>
         <w:t xml:space="preserve"> </w:t>
@@ -37273,13 +36691,7 @@
         <w:t xml:space="preserve">v. Mason</w:t>
       </w:r>
       <w:r>
-        <w:t xml:space="preserve">, 2019</w:t>
-      </w:r>
-      <w:r>
-        <w:noBreakHyphen/>
-      </w:r>
-      <w:r>
-        <w:t xml:space="preserve">01821 (La. 08/14/20), 2020 WL 4726952;</w:t>
+        <w:t xml:space="preserve">, 2019-⁠01821 (La. 08/14/20), 2020 WL 4726952;</w:t>
       </w:r>
       <w:r>
         <w:t xml:space="preserve"> </w:t>
@@ -37306,13 +36718,7 @@
         <w:t xml:space="preserve">v. Mims</w:t>
       </w:r>
       <w:r>
-        <w:t xml:space="preserve">, 2019</w:t>
-      </w:r>
-      <w:r>
-        <w:noBreakHyphen/>
-      </w:r>
-      <w:r>
-        <w:t xml:space="preserve">2088 (La. 08/14/20); 300 So.3d 867;</w:t>
+        <w:t xml:space="preserve">, 2019-⁠2088 (La. 08/14/20); 300 So.3d 867;</w:t>
       </w:r>
       <w:r>
         <w:t xml:space="preserve"> </w:t>
@@ -37339,13 +36745,7 @@
         <w:t xml:space="preserve">v. Williams</w:t>
       </w:r>
       <w:r>
-        <w:t xml:space="preserve">, 2019</w:t>
-      </w:r>
-      <w:r>
-        <w:noBreakHyphen/>
-      </w:r>
-      <w:r>
-        <w:t xml:space="preserve">02010 (La. 08/14/20); 300 So.3d 856;</w:t>
+        <w:t xml:space="preserve">, 2019-⁠02010 (La. 08/14/20); 300 So.3d 856;</w:t>
       </w:r>
       <w:r>
         <w:t xml:space="preserve"> </w:t>
@@ -37372,13 +36772,7 @@
         <w:t xml:space="preserve">v. Brooks</w:t>
       </w:r>
       <w:r>
-        <w:t xml:space="preserve">, 2020</w:t>
-      </w:r>
-      <w:r>
-        <w:noBreakHyphen/>
-      </w:r>
-      <w:r>
-        <w:t xml:space="preserve">00378 (La. 10/14/20), 2020 WL 6059695;</w:t>
+        <w:t xml:space="preserve">, 2020-⁠00378 (La. 10/14/20), 2020 WL 6059695;</w:t>
       </w:r>
       <w:r>
         <w:t xml:space="preserve"> </w:t>
@@ -37405,13 +36799,7 @@
         <w:t xml:space="preserve">v. Cook</w:t>
       </w:r>
       <w:r>
-        <w:t xml:space="preserve">, 2020</w:t>
-      </w:r>
-      <w:r>
-        <w:noBreakHyphen/>
-      </w:r>
-      <w:r>
-        <w:t xml:space="preserve">00001 (La. 08/14/20); 300 So.3d 838;</w:t>
+        <w:t xml:space="preserve">, 2020-⁠00001 (La. 08/14/20); 300 So.3d 838;</w:t>
       </w:r>
       <w:r>
         <w:t xml:space="preserve"> </w:t>
@@ -37438,13 +36826,7 @@
         <w:t xml:space="preserve">v. Parish</w:t>
       </w:r>
       <w:r>
-        <w:t xml:space="preserve">, 2020</w:t>
-      </w:r>
-      <w:r>
-        <w:noBreakHyphen/>
-      </w:r>
-      <w:r>
-        <w:t xml:space="preserve">00072 (La. 08/14/20); 300 So.3d 861;</w:t>
+        <w:t xml:space="preserve">, 2020-⁠00072 (La. 08/14/20); 300 So.3d 861;</w:t>
       </w:r>
       <w:r>
         <w:t xml:space="preserve"> </w:t>
@@ -37471,13 +36853,7 @@
         <w:t xml:space="preserve">v. McGuire</w:t>
       </w:r>
       <w:r>
-        <w:t xml:space="preserve">, 2019</w:t>
-      </w:r>
-      <w:r>
-        <w:noBreakHyphen/>
-      </w:r>
-      <w:r>
-        <w:t xml:space="preserve">01632 (La. 08/14/20); 300 So.3d 830;</w:t>
+        <w:t xml:space="preserve">, 2019-⁠01632 (La. 08/14/20); 300 So.3d 830;</w:t>
       </w:r>
       <w:r>
         <w:t xml:space="preserve"> </w:t>
@@ -37504,13 +36880,7 @@
         <w:t xml:space="preserve">v. Williams</w:t>
       </w:r>
       <w:r>
-        <w:t xml:space="preserve">, 2020</w:t>
-      </w:r>
-      <w:r>
-        <w:noBreakHyphen/>
-      </w:r>
-      <w:r>
-        <w:t xml:space="preserve">00069 (La. 08/14/20); 300 So.3d 860;</w:t>
+        <w:t xml:space="preserve">, 2020-⁠00069 (La. 08/14/20); 300 So.3d 860;</w:t>
       </w:r>
       <w:r>
         <w:t xml:space="preserve"> </w:t>
@@ -37537,13 +36907,7 @@
         <w:t xml:space="preserve">v. Withers</w:t>
       </w:r>
       <w:r>
-        <w:t xml:space="preserve">, 2020</w:t>
-      </w:r>
-      <w:r>
-        <w:noBreakHyphen/>
-      </w:r>
-      <w:r>
-        <w:t xml:space="preserve">00258 (La. 08/14/20); 300 So.3d 860;</w:t>
+        <w:t xml:space="preserve">, 2020-⁠00258 (La. 08/14/20); 300 So.3d 860;</w:t>
       </w:r>
       <w:r>
         <w:t xml:space="preserve"> </w:t>
@@ -37570,13 +36934,7 @@
         <w:t xml:space="preserve">v. Wardlaw</w:t>
       </w:r>
       <w:r>
-        <w:t xml:space="preserve">, 2020</w:t>
-      </w:r>
-      <w:r>
-        <w:noBreakHyphen/>
-      </w:r>
-      <w:r>
-        <w:t xml:space="preserve">00004 (La. 08/14/20); 300 So.3d 859;</w:t>
+        <w:t xml:space="preserve">, 2020-⁠00004 (La. 08/14/20); 300 So.3d 859;</w:t>
       </w:r>
       <w:r>
         <w:t xml:space="preserve"> </w:t>
@@ -37603,13 +36961,7 @@
         <w:t xml:space="preserve">v. Sonnier</w:t>
       </w:r>
       <w:r>
-        <w:t xml:space="preserve">, 2019</w:t>
-      </w:r>
-      <w:r>
-        <w:noBreakHyphen/>
-      </w:r>
-      <w:r>
-        <w:t xml:space="preserve">02066 (La. 08/14/20); 300 So.3d 857;</w:t>
+        <w:t xml:space="preserve">, 2019-⁠02066 (La. 08/14/20); 300 So.3d 857;</w:t>
       </w:r>
       <w:r>
         <w:t xml:space="preserve"> </w:t>
@@ -37636,13 +36988,7 @@
         <w:t xml:space="preserve">v. Pittman</w:t>
       </w:r>
       <w:r>
-        <w:t xml:space="preserve">, 2019</w:t>
-      </w:r>
-      <w:r>
-        <w:noBreakHyphen/>
-      </w:r>
-      <w:r>
-        <w:t xml:space="preserve">01354 (La. 08/14/20); 300 So.3d 856;</w:t>
+        <w:t xml:space="preserve">, 2019-⁠01354 (La. 08/14/20); 300 So.3d 856;</w:t>
       </w:r>
       <w:r>
         <w:t xml:space="preserve"> </w:t>
@@ -37669,13 +37015,7 @@
         <w:t xml:space="preserve">v. Carter</w:t>
       </w:r>
       <w:r>
-        <w:t xml:space="preserve">, 2019</w:t>
-      </w:r>
-      <w:r>
-        <w:noBreakHyphen/>
-      </w:r>
-      <w:r>
-        <w:t xml:space="preserve">02053 (La. 08/14/20); 300 So.3d 856;</w:t>
+        <w:t xml:space="preserve">, 2019-⁠02053 (La. 08/14/20); 300 So.3d 856;</w:t>
       </w:r>
       <w:r>
         <w:t xml:space="preserve"> </w:t>
@@ -37702,13 +37042,7 @@
         <w:t xml:space="preserve">v. Eaglin</w:t>
       </w:r>
       <w:r>
-        <w:t xml:space="preserve">, 2019</w:t>
-      </w:r>
-      <w:r>
-        <w:noBreakHyphen/>
-      </w:r>
-      <w:r>
-        <w:t xml:space="preserve">01952 (La. 08/14/20); 300 So.3d 840;</w:t>
+        <w:t xml:space="preserve">, 2019-⁠01952 (La. 08/14/20); 300 So.3d 840;</w:t>
       </w:r>
       <w:r>
         <w:t xml:space="preserve"> </w:t>
@@ -37735,13 +37069,7 @@
         <w:t xml:space="preserve">v. Sims</w:t>
       </w:r>
       <w:r>
-        <w:t xml:space="preserve">, 2020</w:t>
-      </w:r>
-      <w:r>
-        <w:noBreakHyphen/>
-      </w:r>
-      <w:r>
-        <w:t xml:space="preserve">00298 (La. 09/08/20); 301 So.3d 17;</w:t>
+        <w:t xml:space="preserve">, 2020-⁠00298 (La. 09/08/20); 301 So.3d 17;</w:t>
       </w:r>
       <w:r>
         <w:t xml:space="preserve"> </w:t>
@@ -37768,13 +37096,7 @@
         <w:t xml:space="preserve">v. Johnson</w:t>
       </w:r>
       <w:r>
-        <w:t xml:space="preserve">, 2020</w:t>
-      </w:r>
-      <w:r>
-        <w:noBreakHyphen/>
-      </w:r>
-      <w:r>
-        <w:t xml:space="preserve">00052 (La. 09/29/20), 2020 WL 5793805.</w:t>
+        <w:t xml:space="preserve">, 2020-⁠00052 (La. 09/29/20), 2020 WL 5793805.</w:t>
       </w:r>
     </w:p>
   </w:footnote>
@@ -37867,13 +37189,7 @@
         <w:t xml:space="preserve">Cinque, L.L.C. v. Pacific Ins. Co. Ltd.</w:t>
       </w:r>
       <w:r>
-        <w:t xml:space="preserve">, 10</w:t>
-      </w:r>
-      <w:r>
-        <w:noBreakHyphen/>
-      </w:r>
-      <w:r>
-        <w:t xml:space="preserve">1164 (La. 05/21/10); 36 So.3d 236;</w:t>
+        <w:t xml:space="preserve">, 10-⁠1164 (La. 05/21/10); 36 So.3d 236;</w:t>
       </w:r>
       <w:r>
         <w:t xml:space="preserve"> </w:t>
@@ -37886,13 +37202,7 @@
         <w:t xml:space="preserve">see also, Davis v. Jazz Casino Co., L.L.C.</w:t>
       </w:r>
       <w:r>
-        <w:t xml:space="preserve">, 03</w:t>
-      </w:r>
-      <w:r>
-        <w:noBreakHyphen/>
-      </w:r>
-      <w:r>
-        <w:t xml:space="preserve">0276, p.1 (La. 06/06/03); 849 So.2d 497, 498 (when a court of appeal “declines to exercise its supervisory jurisdiction by denying the writ, the court was without jurisdiction to affirm, reverse or modify the judgment of the trial court. Thus, any language in the court of appeal’s earlier writ denial purporting to find no error in the trial court’s certification ruling is without effect.”).</w:t>
+        <w:t xml:space="preserve">, 03-⁠0276, p.1 (La. 06/06/03); 849 So.2d 497, 498 (when a court of appeal “declines to exercise its supervisory jurisdiction by denying the writ, the court was without jurisdiction to affirm, reverse or modify the judgment of the trial court. Thus, any language in the court of appeal’s earlier writ denial purporting to find no error in the trial court’s certification ruling is without effect.”).</w:t>
       </w:r>
     </w:p>
   </w:footnote>

</xml_diff>